<commit_message>
Docs & help: art department workflow
- Help Center: new "Art & Production" section with "The art department
  workflow" article (submit to art, Queue/Kanban, upload art, send proof).
- Update proof-approvals and order-tracker articles: proof now shown on the
  tracker with Approve / Request changes / Decline / Request a meeting.
- Update orders article (Submit to art) and Template Builder (catalogue image).
- Training guide: add "After the quote: order, art & proofing" section.
- DELIVERED_SCOPE: art workflow + proof-on-tracker + meeting request.
</commit_message>
<xml_diff>
--- a/docs/training/GMW_Rep_Quoting_Guide.docx
+++ b/docs/training/GMW_Rep_Quoting_Guide.docx
@@ -1016,6 +1016,154 @@
           <w:color w:val="0F172A"/>
           <w:sz w:val="36"/>
         </w:rPr>
+        <w:t>After the quote: order, art &amp; proofing</w:t>
+      </w:r>
+    </w:p>
+    <w:p>
+      <w:pPr>
+        <w:spacing w:after="120" w:before="0"/>
+      </w:pPr>
+      <w:r>
+        <w:rPr>
+          <w:rFonts w:ascii="Calibri" w:hAnsi="Calibri"/>
+          <w:b w:val="0"/>
+          <w:i w:val="0"/>
+          <w:color w:val="475569"/>
+          <w:sz w:val="21"/>
+        </w:rPr>
+        <w:t>Once the quote is accepted and converted to an order:</w:t>
+      </w:r>
+    </w:p>
+    <w:p>
+      <w:pPr>
+        <w:spacing w:after="60"/>
+      </w:pPr>
+      <w:r>
+        <w:rPr>
+          <w:rFonts w:ascii="Calibri" w:hAnsi="Calibri"/>
+          <w:b/>
+          <w:i w:val="0"/>
+          <w:color w:val="0F172A"/>
+          <w:sz w:val="21"/>
+        </w:rPr>
+        <w:t xml:space="preserve">1.  </w:t>
+      </w:r>
+      <w:r>
+        <w:rPr>
+          <w:rFonts w:ascii="Calibri" w:hAnsi="Calibri"/>
+          <w:b w:val="0"/>
+          <w:i w:val="0"/>
+          <w:color w:val="475569"/>
+          <w:sz w:val="21"/>
+        </w:rPr>
+        <w:t>Submit to art. On the order, click "Submit to art." The catalogue image the customer picked and the production spec go to the art department, and the order moves to the Art &amp; Proof stage.</w:t>
+      </w:r>
+    </w:p>
+    <w:p>
+      <w:pPr>
+        <w:spacing w:after="60"/>
+      </w:pPr>
+      <w:r>
+        <w:rPr>
+          <w:rFonts w:ascii="Calibri" w:hAnsi="Calibri"/>
+          <w:b/>
+          <w:i w:val="0"/>
+          <w:color w:val="0F172A"/>
+          <w:sz w:val="21"/>
+        </w:rPr>
+        <w:t xml:space="preserve">2.  </w:t>
+      </w:r>
+      <w:r>
+        <w:rPr>
+          <w:rFonts w:ascii="Calibri" w:hAnsi="Calibri"/>
+          <w:b w:val="0"/>
+          <w:i w:val="0"/>
+          <w:color w:val="475569"/>
+          <w:sz w:val="21"/>
+        </w:rPr>
+        <w:t>Art does the work. The art team picks it up on the Art board (Queue or Kanban), uploads the proposed artwork, and sends a proof.</w:t>
+      </w:r>
+    </w:p>
+    <w:p>
+      <w:pPr>
+        <w:spacing w:after="60"/>
+      </w:pPr>
+      <w:r>
+        <w:rPr>
+          <w:rFonts w:ascii="Calibri" w:hAnsi="Calibri"/>
+          <w:b/>
+          <w:i w:val="0"/>
+          <w:color w:val="0F172A"/>
+          <w:sz w:val="21"/>
+        </w:rPr>
+        <w:t xml:space="preserve">3.  </w:t>
+      </w:r>
+      <w:r>
+        <w:rPr>
+          <w:rFonts w:ascii="Calibri" w:hAnsi="Calibri"/>
+          <w:b w:val="0"/>
+          <w:i w:val="0"/>
+          <w:color w:val="475569"/>
+          <w:sz w:val="21"/>
+        </w:rPr>
+        <w:t>The customer approves on their tracking link. The proposed image shows up on the same tracking link the customer already uses to follow their order. They can Approve, Request changes (with notes), Decline, or Request a meeting (which offers your booking link).</w:t>
+      </w:r>
+    </w:p>
+    <w:p>
+      <w:pPr>
+        <w:spacing w:after="60"/>
+      </w:pPr>
+      <w:r>
+        <w:rPr>
+          <w:rFonts w:ascii="Calibri" w:hAnsi="Calibri"/>
+          <w:b/>
+          <w:i w:val="0"/>
+          <w:color w:val="0F172A"/>
+          <w:sz w:val="21"/>
+        </w:rPr>
+        <w:t xml:space="preserve">4.  </w:t>
+      </w:r>
+      <w:r>
+        <w:rPr>
+          <w:rFonts w:ascii="Calibri" w:hAnsi="Calibri"/>
+          <w:b w:val="0"/>
+          <w:i w:val="0"/>
+          <w:color w:val="475569"/>
+          <w:sz w:val="21"/>
+        </w:rPr>
+        <w:t>You're notified of their decision, and it's logged to the customer's history. If they request changes, art revises and sends a new proof.</w:t>
+      </w:r>
+    </w:p>
+    <w:p>
+      <w:pPr>
+        <w:spacing w:after="120" w:before="0"/>
+      </w:pPr>
+      <w:r>
+        <w:rPr>
+          <w:rFonts w:ascii="Calibri" w:hAnsi="Calibri"/>
+          <w:b w:val="0"/>
+          <w:i w:val="0"/>
+          <w:color w:val="475569"/>
+          <w:sz w:val="21"/>
+        </w:rPr>
+        <w:t>You don't manage the art tools yourself — just submit to art and watch the order advance. For the catalogue image to travel with the order, make sure the item has an image (your admin sets these in the Template Builder).</w:t>
+      </w:r>
+    </w:p>
+    <w:p>
+      <w:pPr>
+        <w:keepNext/>
+        <w:spacing w:before="360" w:after="160"/>
+        <w:pBdr>
+          <w:bottom w:val="single" w:sz="6" w:color="1D4ED8"/>
+        </w:pBdr>
+      </w:pPr>
+      <w:r>
+        <w:rPr>
+          <w:rFonts w:ascii="Calibri" w:hAnsi="Calibri"/>
+          <w:b/>
+          <w:color w:val="0F172A"/>
+          <w:sz w:val="36"/>
+        </w:rPr>
         <w:t>FAQ</w:t>
       </w:r>
     </w:p>

</xml_diff>